<commit_message>
Codigos para auditoria de examenes y lecciones generados, documento de Contexto, actualizacionesa documentos existentes
</commit_message>
<xml_diff>
--- a/Examen_generado/Los Viajes de Colón - grado 8.docx
+++ b/Examen_generado/Los Viajes de Colón - grado 8.docx
@@ -13,7 +13,12 @@
     </w:p>
     <w:p>
       <w:r>
-        <w:t>Generado: 2026-10-19 03:35 UTC</w:t>
+        <w:t>Generado: 2026-10-20 00:47 UTC</w:t>
+      </w:r>
+    </w:p>
+    <w:p>
+      <w:r>
+        <w:t>Material de referencia: data\raw\history\grade8_supplement\8th Grade Test - Colombus Trips.docx</w:t>
       </w:r>
     </w:p>
     <w:p/>
@@ -22,12 +27,12 @@
         <w:rPr>
           <w:i/>
         </w:rPr>
-        <w:t>1. (Comprender / DOK1) ⚠</w:t>
+        <w:t>1. (Comprender / DOK1 / respuesta_corta / 5pts) ⚠</w:t>
       </w:r>
     </w:p>
     <w:p>
       <w:r>
-        <w:t>¿Cuál fue el resultado directo del impacto del Santa Maria en la costa de Hispaniola?</w:t>
+        <w:t>¿Qué tipo de estructura se construyó en la costa después de que la Santa Maria se hundió?</w:t>
       </w:r>
     </w:p>
     <w:p/>
@@ -50,7 +55,61 @@
         <w:pStyle w:val="ListBullet"/>
       </w:pPr>
       <w:r>
-        <w:t>[warning] history_8_gen0 (llm_juez): No hay suficiente contexto.</w:t>
+        <w:t>[warning] history_8_gen0 (llm_juez): No es clara.</w:t>
+      </w:r>
+    </w:p>
+    <w:p>
+      <w:r>
+        <w:br w:type="page"/>
+      </w:r>
+    </w:p>
+    <w:p>
+      <w:r>
+        <w:rPr>
+          <w:b/>
+          <w:sz w:val="26"/>
+        </w:rPr>
+        <w:t>Reporte de auditoría — NO APROBADO</w:t>
+      </w:r>
+    </w:p>
+    <w:p>
+      <w:pPr>
+        <w:pStyle w:val="ListBullet"/>
+      </w:pPr>
+      <w:r>
+        <w:t>[FALLA] Puntuación total &gt; 50: Total: 5 puntos (1 pregunta(s)).</w:t>
+      </w:r>
+    </w:p>
+    <w:p>
+      <w:pPr>
+        <w:pStyle w:val="ListBullet"/>
+      </w:pPr>
+      <w:r>
+        <w:t>[FALLA] Mínimo 4 partes distintas: Partes encontradas (1): respuesta_corta.</w:t>
+      </w:r>
+    </w:p>
+    <w:p>
+      <w:pPr>
+        <w:pStyle w:val="ListBullet"/>
+      </w:pPr>
+      <w:r>
+        <w:t>[FALLA] Cobertura de temas comparable al material fuente: Similaridad coseno entre distribución de estándares: 0.00 (umbral 0.5). Fuente: {'CC': 10}. Generado: {'IC': 1}.</w:t>
+      </w:r>
+    </w:p>
+    <w:p>
+      <w:pPr>
+        <w:pStyle w:val="ListBullet"/>
+      </w:pPr>
+      <w:r>
+        <w:t>[OK] Sin fuga de respuesta: No hay preguntas de opción múltiple en este examen.</w:t>
+      </w:r>
+    </w:p>
+    <w:p>
+      <w:pPr>
+        <w:pStyle w:val="ListBullet"/>
+      </w:pPr>
+      <w:r>
+        <w:t>[OK] Sin preguntas casi duplicadas: Menos de 2 preguntas generadas — no hay pares que comparar.</w:t>
       </w:r>
     </w:p>
     <w:sectPr>

</xml_diff>